<commit_message>
Abstract rewritten without mathematical notation; DOCX regenerated
Co-Authored-By: Claude Fable 5.1 <noreply@anthropic.com>
</commit_message>
<xml_diff>
--- a/paper/paper.docx
+++ b/paper/paper.docx
@@ -31,139 +31,7 @@
         <w:pStyle w:val="Abstract"/>
       </w:pPr>
       <w:r>
-        <w:t xml:space="preserve">Regev’s quantum factoring algorithm spends, summed over its runs, a number of sequential group operations proportional to the bit length of the group in which it collects relations. The class group of</w:t>
-      </w:r>
-      <w:r>
-        <w:t xml:space="preserve"> </w:t>
-      </w:r>
-      <m:oMath>
-        <m:r>
-          <m:rPr>
-            <m:scr m:val="double-struck"/>
-            <m:sty m:val="p"/>
-          </m:rPr>
-          <m:t>Q</m:t>
-        </m:r>
-        <m:r>
-          <m:rPr>
-            <m:sty m:val="p"/>
-          </m:rPr>
-          <m:t>(</m:t>
-        </m:r>
-        <m:rad>
-          <m:radPr>
-            <m:degHide m:val="on"/>
-          </m:radPr>
-          <m:deg/>
-          <m:e>
-            <m:r>
-              <m:rPr>
-                <m:sty m:val="p"/>
-              </m:rPr>
-              <m:t>−</m:t>
-            </m:r>
-            <m:r>
-              <m:t>N</m:t>
-            </m:r>
-          </m:e>
-        </m:rad>
-        <m:r>
-          <m:rPr>
-            <m:sty m:val="p"/>
-          </m:rPr>
-          <m:t>)</m:t>
-        </m:r>
-      </m:oMath>
-      <w:r>
-        <w:t xml:space="preserve"> </w:t>
-      </w:r>
-      <w:r>
-        <w:t xml:space="preserve">has order about</w:t>
-      </w:r>
-      <w:r>
-        <w:t xml:space="preserve"> </w:t>
-      </w:r>
-      <m:oMath>
-        <m:rad>
-          <m:radPr>
-            <m:degHide m:val="on"/>
-          </m:radPr>
-          <m:deg/>
-          <m:e>
-            <m:r>
-              <m:t>N</m:t>
-            </m:r>
-          </m:e>
-        </m:rad>
-      </m:oMath>
-      <w:r>
-        <w:t xml:space="preserve">, half the bits of</w:t>
-      </w:r>
-      <w:r>
-        <w:t xml:space="preserve"> </w:t>
-      </w:r>
-      <m:oMath>
-        <m:r>
-          <m:rPr>
-            <m:sty m:val="p"/>
-          </m:rPr>
-          <m:t>(</m:t>
-        </m:r>
-        <m:r>
-          <m:rPr>
-            <m:scr m:val="double-struck"/>
-            <m:sty m:val="p"/>
-          </m:rPr>
-          <m:t>Z</m:t>
-        </m:r>
-        <m:r>
-          <m:rPr>
-            <m:sty m:val="p"/>
-          </m:rPr>
-          <m:t>/</m:t>
-        </m:r>
-        <m:r>
-          <m:t>N</m:t>
-        </m:r>
-        <m:r>
-          <m:rPr>
-            <m:scr m:val="double-struck"/>
-            <m:sty m:val="p"/>
-          </m:rPr>
-          <m:t>Z</m:t>
-        </m:r>
-        <m:sSup>
-          <m:e>
-            <m:r>
-              <m:rPr>
-                <m:sty m:val="p"/>
-              </m:rPr>
-              <m:t>)</m:t>
-            </m:r>
-          </m:e>
-          <m:sup>
-            <m:r>
-              <m:rPr>
-                <m:sty m:val="p"/>
-              </m:rPr>
-              <m:t>*</m:t>
-            </m:r>
-          </m:sup>
-        </m:sSup>
-      </m:oMath>
-      <w:r>
-        <w:t xml:space="preserve">, and its elements of order two are the factorization of</w:t>
-      </w:r>
-      <w:r>
-        <w:t xml:space="preserve"> </w:t>
-      </w:r>
-      <m:oMath>
-        <m:r>
-          <m:t>N</m:t>
-        </m:r>
-      </m:oMath>
-      <w:r>
-        <w:t xml:space="preserve">. We make the resulting algorithm explicit, with prime forms of small norm as the</w:t>
+        <w:t xml:space="preserve">Regev’s quantum factoring algorithm spends, summed over its runs, a number of sequential group operations proportional to the bit length of the group in which it collects relations. The class group of the imaginary quadratic field attached to the modulus has about half as many bits as the multiplicative group modulo the modulus, and its elements of order two are the factorization itself. We make the resulting algorithm explicit, with prime forms of small norm as the</w:t>
       </w:r>
       <w:r>
         <w:t xml:space="preserve"> </w:t>
@@ -175,104 +43,7 @@
         <w:t xml:space="preserve"> </w:t>
       </w:r>
       <w:r>
-        <w:t xml:space="preserve">that Ekerå and Gärtner identified as the obstacle to generalizing Regev, prove the reduction from factoring to the class number, verify the classical post-processing on moduli up to 189 bits, and simulate the quantum sampler end to end, recovering the relation lattice with index one. We then cost the route at 4096 bits. Squaring a form contains a modular inverse with respect to a quantum modulus, and we show this is intrinsic to the form model. Deriving the NUDUPL squaring identity, measuring its operation counts on real 4096-bit forms, and executing verified branch-free reversible designs for the inverse and the partial Euclid under one adder-cost convention, we find that a class-group squaring costs</w:t>
-      </w:r>
-      <w:r>
-        <w:t xml:space="preserve"> </w:t>
-      </w:r>
-      <m:oMath>
-        <m:r>
-          <m:t>4.2</m:t>
-        </m:r>
-        <m:r>
-          <m:rPr>
-            <m:sty m:val="p"/>
-          </m:rPr>
-          <m:t>×</m:t>
-        </m:r>
-      </m:oMath>
-      <w:r>
-        <w:t xml:space="preserve"> </w:t>
-      </w:r>
-      <w:r>
-        <w:t xml:space="preserve">to</w:t>
-      </w:r>
-      <w:r>
-        <w:t xml:space="preserve"> </w:t>
-      </w:r>
-      <m:oMath>
-        <m:r>
-          <m:t>7.6</m:t>
-        </m:r>
-        <m:r>
-          <m:rPr>
-            <m:sty m:val="p"/>
-          </m:rPr>
-          <m:t>×</m:t>
-        </m:r>
-      </m:oMath>
-      <w:r>
-        <w:t xml:space="preserve"> </w:t>
-      </w:r>
-      <w:r>
-        <w:t xml:space="preserve">an integer squaring. After the halved operation count the route remains</w:t>
-      </w:r>
-      <w:r>
-        <w:t xml:space="preserve"> </w:t>
-      </w:r>
-      <m:oMath>
-        <m:r>
-          <m:t>2.3</m:t>
-        </m:r>
-        <m:r>
-          <m:rPr>
-            <m:sty m:val="p"/>
-          </m:rPr>
-          <m:t>×</m:t>
-        </m:r>
-      </m:oMath>
-      <w:r>
-        <w:t xml:space="preserve"> </w:t>
-      </w:r>
-      <w:r>
-        <w:t xml:space="preserve">to</w:t>
-      </w:r>
-      <w:r>
-        <w:t xml:space="preserve"> </w:t>
-      </w:r>
-      <m:oMath>
-        <m:r>
-          <m:t>4.2</m:t>
-        </m:r>
-        <m:r>
-          <m:rPr>
-            <m:sty m:val="p"/>
-          </m:rPr>
-          <m:t>×</m:t>
-        </m:r>
-      </m:oMath>
-      <w:r>
-        <w:t xml:space="preserve"> </w:t>
-      </w:r>
-      <w:r>
-        <w:t xml:space="preserve">more expensive; its Euclidean components alone exceed the integer step by</w:t>
-      </w:r>
-      <w:r>
-        <w:t xml:space="preserve"> </w:t>
-      </w:r>
-      <m:oMath>
-        <m:r>
-          <m:t>2.4</m:t>
-        </m:r>
-        <m:r>
-          <m:rPr>
-            <m:sty m:val="p"/>
-          </m:rPr>
-          <m:t>×</m:t>
-        </m:r>
-      </m:oMath>
-      <w:r>
-        <w:t xml:space="preserve">. We close with an information-theoretic floor that places the class group at the minimum group size for order-finding, and a modulus obstruction explaining why every group of that size pays for its arithmetic.</w:t>
+        <w:t xml:space="preserve">that Ekerå and Gärtner identified as the obstacle to generalizing Regev, prove the reduction from factoring to the class number, verify the classical post-processing on moduli up to 189 bits, and simulate the quantum sampler end to end, recovering the relation lattice exactly. We then cost the route at a 4096-bit modulus. Squaring a form contains a modular inverse with respect to a quantum modulus, and we show this is intrinsic to the form model. Deriving the NUDUPL squaring identity, measuring its operation counts on real 4096-bit forms, and executing verified branch-free reversible designs for the inverse and the partial Euclidean reduction under one adder-cost convention, we find that a class-group squaring costs between four and eight times an integer squaring. After the halved operation count the route remains between two and four times more expensive, and its Euclidean components alone exceed the integer step by a factor of two and a half. We close with an information-theoretic floor that places the class group at the minimum group size for order-finding, and a modulus obstruction explaining why every group of that size pays for its arithmetic.</w:t>
       </w:r>
     </w:p>
     <w:bookmarkStart w:id="9" w:name="index-terms"/>

</xml_diff>